<commit_message>
Remove all horizontal lines from resumes — no lines under headers or contact info
Co-Authored-By: Claude Sonnet 4.6 <noreply@anthropic.com>
Claude-Session: https://claude.ai/code/session_01VXdBnAWV4RF8c2tdGsbE5P
</commit_message>
<xml_diff>
--- a/Myeisha_Cheek_Resume_Family_Law_Paralegal_BeaconHill.docx
+++ b/Myeisha_Cheek_Resume_Family_Law_Paralegal_BeaconHill.docx
@@ -34,19 +34,8 @@
     </w:p>
     <w:p>
       <w:pPr>
-        <w:spacing w:before="40" w:after="40"/>
-        <w:pBdr>
-          <w:bottom w:val="single" w:sz="6" w:space="1" w:color="000000"/>
-        </w:pBdr>
-      </w:pPr>
-    </w:p>
-    <w:p>
-      <w:pPr>
         <w:spacing w:before="200" w:after="80"/>
         <w:jc w:val="left"/>
-        <w:pBdr>
-          <w:bottom w:val="single" w:sz="4" w:space="1" w:color="000000"/>
-        </w:pBdr>
       </w:pPr>
       <w:r>
         <w:rPr>
@@ -75,19 +64,8 @@
     </w:p>
     <w:p>
       <w:pPr>
-        <w:spacing w:before="40" w:after="40"/>
-        <w:pBdr>
-          <w:bottom w:val="single" w:sz="6" w:space="1" w:color="000000"/>
-        </w:pBdr>
-      </w:pPr>
-    </w:p>
-    <w:p>
-      <w:pPr>
         <w:spacing w:before="200" w:after="80"/>
         <w:jc w:val="left"/>
-        <w:pBdr>
-          <w:bottom w:val="single" w:sz="4" w:space="1" w:color="000000"/>
-        </w:pBdr>
       </w:pPr>
       <w:r>
         <w:rPr>
@@ -637,19 +615,8 @@
     </w:p>
     <w:p>
       <w:pPr>
-        <w:spacing w:before="40" w:after="40"/>
-        <w:pBdr>
-          <w:bottom w:val="single" w:sz="6" w:space="1" w:color="000000"/>
-        </w:pBdr>
-      </w:pPr>
-    </w:p>
-    <w:p>
-      <w:pPr>
         <w:spacing w:before="200" w:after="80"/>
         <w:jc w:val="left"/>
-        <w:pBdr>
-          <w:bottom w:val="single" w:sz="4" w:space="1" w:color="000000"/>
-        </w:pBdr>
       </w:pPr>
       <w:r>
         <w:rPr>
@@ -711,19 +678,8 @@
     </w:p>
     <w:p>
       <w:pPr>
-        <w:spacing w:before="40" w:after="40"/>
-        <w:pBdr>
-          <w:bottom w:val="single" w:sz="6" w:space="1" w:color="000000"/>
-        </w:pBdr>
-      </w:pPr>
-    </w:p>
-    <w:p>
-      <w:pPr>
         <w:spacing w:before="200" w:after="80"/>
         <w:jc w:val="left"/>
-        <w:pBdr>
-          <w:bottom w:val="single" w:sz="4" w:space="1" w:color="000000"/>
-        </w:pBdr>
       </w:pPr>
       <w:r>
         <w:rPr>

</xml_diff>

<commit_message>
Restore underlines under section headers, keep contact info line removed
Co-Authored-By: Claude Sonnet 4.6 <noreply@anthropic.com>
Claude-Session: https://claude.ai/code/session_01VXdBnAWV4RF8c2tdGsbE5P
</commit_message>
<xml_diff>
--- a/Myeisha_Cheek_Resume_Family_Law_Paralegal_BeaconHill.docx
+++ b/Myeisha_Cheek_Resume_Family_Law_Paralegal_BeaconHill.docx
@@ -36,6 +36,9 @@
       <w:pPr>
         <w:spacing w:before="200" w:after="80"/>
         <w:jc w:val="left"/>
+        <w:pBdr>
+          <w:bottom w:val="single" w:sz="4" w:space="1" w:color="000000"/>
+        </w:pBdr>
       </w:pPr>
       <w:r>
         <w:rPr>
@@ -66,6 +69,9 @@
       <w:pPr>
         <w:spacing w:before="200" w:after="80"/>
         <w:jc w:val="left"/>
+        <w:pBdr>
+          <w:bottom w:val="single" w:sz="4" w:space="1" w:color="000000"/>
+        </w:pBdr>
       </w:pPr>
       <w:r>
         <w:rPr>
@@ -617,6 +623,9 @@
       <w:pPr>
         <w:spacing w:before="200" w:after="80"/>
         <w:jc w:val="left"/>
+        <w:pBdr>
+          <w:bottom w:val="single" w:sz="4" w:space="1" w:color="000000"/>
+        </w:pBdr>
       </w:pPr>
       <w:r>
         <w:rPr>
@@ -680,6 +689,9 @@
       <w:pPr>
         <w:spacing w:before="200" w:after="80"/>
         <w:jc w:val="left"/>
+        <w:pBdr>
+          <w:bottom w:val="single" w:sz="4" w:space="1" w:color="000000"/>
+        </w:pBdr>
       </w:pPr>
       <w:r>
         <w:rPr>

</xml_diff>